<commit_message>
Resume: Security Operations Center Analyst @ HGS (mid-tier)
</commit_message>
<xml_diff>
--- a/resumes/Resume_Security_Operations_Center_Analyst_HGS__mid-tier_.docx
+++ b/resumes/Resume_Security_Operations_Center_Analyst_HGS__mid-tier_.docx
@@ -413,7 +413,7 @@
           <w:sz w:val="19"/>
           <w:szCs w:val="19"/>
         </w:rPr>
-        <w:t>Triaged 50+ weekly inventory reimbursement cases by severity and policy, applying structured workflows and incident response principles.</w:t>
+        <w:t>Triaged 50+ weekly inventory reimbursement cases by severity and policy eligibility, following structured workflows and escalating findings to senior reviewers.</w:t>
       </w:r>
     </w:p>
     <w:p>
@@ -432,7 +432,7 @@
           <w:sz w:val="19"/>
           <w:szCs w:val="19"/>
         </w:rPr>
-        <w:t>Investigated seller claims, identified policy violations and anomalous patterns, and escalated findings to senior reviewers, applying vulnerability management and SIEM skills.</w:t>
+        <w:t>Analyzed seller claims, identified policy violations and anomalous patterns, and escalated findings to senior reviewers.</w:t>
       </w:r>
     </w:p>
     <w:p>
@@ -451,7 +451,7 @@
           <w:sz w:val="19"/>
           <w:szCs w:val="19"/>
         </w:rPr>
-        <w:t>Maintained audit-ready case documentation, recording investigation findings, decisions, evidence notes, and corrective actions, with a focus on threat detection and cybersecurity.</w:t>
+        <w:t>Maintained audit-ready case documentation recording investigation findings, decisions, evidence notes, and corrective actions.</w:t>
       </w:r>
     </w:p>
     <w:p>
@@ -470,7 +470,7 @@
           <w:sz w:val="19"/>
           <w:szCs w:val="19"/>
         </w:rPr>
-        <w:t>Identified recurring fraud patterns in 200+ weekly cases, reducing repeat-issue investigation time through threat intelligence and incident response.</w:t>
+        <w:t>Spotted recurring fraud patterns across 200+ weekly cases and flagged them early, reducing repeat-issue investigation time before escalation.</w:t>
       </w:r>
     </w:p>
     <w:p>
@@ -564,7 +564,7 @@
           <w:sz w:val="19"/>
           <w:szCs w:val="19"/>
         </w:rPr>
-        <w:t>Deployed Splunk SIEM with SPL searches for brute-force detection, lateral movement, and privilege escalation (T1110, T1078, T1059); mapped TTPs and wrote incident report.</w:t>
+        <w:t>Deployed Splunk SIEM with SPL searches for brute-force detection, lateral movement, and privilege escalation (T1110, T1078, T1059); mapped TTPs and wrote PICERL incident report.</w:t>
       </w:r>
     </w:p>
     <w:p>
@@ -583,7 +583,7 @@
           <w:sz w:val="19"/>
           <w:szCs w:val="19"/>
         </w:rPr>
-        <w:t>Built automated SOAR-style detection pipeline: Python script ingests Splunk alerts, enriches with VirusTotal API, and dispatches Telegram notifications with severity classification.</w:t>
+        <w:t>Developed SOAR-style detection pipeline: Python script ingests Splunk alerts, enriches with VirusTotal API, and dispatches Telegram notifications with severity classification.</w:t>
       </w:r>
     </w:p>
     <w:p>
@@ -691,7 +691,7 @@
           <w:sz w:val="19"/>
           <w:szCs w:val="19"/>
         </w:rPr>
-        <w:t>Developed typosquatting detector generating domain variants and checking live DNS resolution to catch brand-impersonation attacks.</w:t>
+        <w:t>Developed typosquatting detector generating domain variants and checking live DNS resolution to catch brand-impersonation attacks early.</w:t>
       </w:r>
     </w:p>
     <w:p>
@@ -710,7 +710,7 @@
           <w:sz w:val="19"/>
           <w:szCs w:val="19"/>
         </w:rPr>
-        <w:t>Deployed Telegram bot interface for live IOC enrichment, supporting bulk CSV input/output and OSINT enrichment via theHarvester for domain profiling.</w:t>
+        <w:t>Developed Telegram bot interface for live IOC enrichment, supporting bulk CSV input/output and OSINT enrichment via theHarvester for domain profiling.</w:t>
       </w:r>
     </w:p>
     <w:p>

</xml_diff>